<commit_message>
Fill affiliation and corresponding author email on title page
</commit_message>
<xml_diff>
--- a/jbi_submission/JBI_Title_Page.docx
+++ b/jbi_submission/JBI_Title_Page.docx
@@ -51,7 +51,7 @@
         <w:t>Affiliations:</w:t>
       </w:r>
       <w:r>
-        <w:t xml:space="preserve"> [Author affiliations and full postal addresses]</w:t>
+        <w:t xml:space="preserve"> The First Clinical College of Shandong University of Traditional Chinese Medicine, Jinan, China</w:t>
       </w:r>
     </w:p>
     <w:p>
@@ -62,7 +62,7 @@
         <w:t>Corresponding author:</w:t>
       </w:r>
       <w:r>
-        <w:t xml:space="preserve"> Zhongyuan Liu, [affiliation], [email]</w:t>
+        <w:t xml:space="preserve"> Zhongyuan Liu, The First Clinical College of Shandong University of Traditional Chinese Medicine, Jinan, China; lzy.lui@qq.com</w:t>
       </w:r>
     </w:p>
     <w:p>

</xml_diff>